<commit_message>
Link live apps, rename Ops, add how-it-fits-together section
- Built & live cards now link to Confluence, Ronke Score and Axie Clash
- 'Ops Consulting' becomes 'Ops' / 'Operations' across the site and résumé
- New block under What I do explaining how strategy, design, build and
  ops combine for a business
- Canonical URL and absolute og:image for tonyliljon.xyz
- Résumé: app links, portfolio URL, updated title

Co-Authored-By: Claude Opus 5.5 <noreply@anthropic.com>
Claude-Session: https://claude.ai/code/session_01JGLzwNp3UHs5D5guWwkDQ9
</commit_message>
<xml_diff>
--- a/resume/Anthony_Littlejohn_Resume.docx
+++ b/resume/Anthony_Littlejohn_Resume.docx
@@ -31,7 +31,7 @@
           <w:sz w:val="23"/>
           <w:szCs w:val="23"/>
         </w:rPr>
-        <w:t xml:space="preserve">Design Engineer  ·  Product Strategy &amp; Ops Consultant</w:t>
+        <w:t xml:space="preserve">Design Engineer  ·  Product Strategy &amp; Ops</w:t>
       </w:r>
     </w:p>
     <w:p>
@@ -46,7 +46,7 @@
         </w:rPr>
         <w:t xml:space="preserve">Remote / open to relocation  ·  </w:t>
       </w:r>
-      <w:hyperlink w:history="1" r:id="rIdznqgzhmm58lbbhlernway">
+      <w:hyperlink w:history="1" r:id="rId3jv31frv5jsbb0ggwbbxd">
         <w:r>
           <w:rPr>
             <w:rFonts w:ascii="Calibri" w:cs="Calibri" w:eastAsia="Calibri" w:hAnsi="Calibri"/>
@@ -66,7 +66,7 @@
         </w:rPr>
         <w:t xml:space="preserve">  ·  </w:t>
       </w:r>
-      <w:hyperlink w:history="1" r:id="rIdehui6lqmphynxckr5qltz">
+      <w:hyperlink w:history="1" r:id="rId1ybhpite9njfcf-cl8re1">
         <w:r>
           <w:rPr>
             <w:rFonts w:ascii="Calibri" w:cs="Calibri" w:eastAsia="Calibri" w:hAnsi="Calibri"/>
@@ -84,7 +84,27 @@
           <w:sz w:val="20"/>
           <w:szCs w:val="20"/>
         </w:rPr>
-        <w:t xml:space="preserve">  ·  Portfolio: [add URL]</w:t>
+        <w:t xml:space="preserve">  ·  </w:t>
+      </w:r>
+      <w:hyperlink w:history="1" r:id="rIdzwe3bgvk6swpa-oxguexx">
+        <w:r>
+          <w:rPr>
+            <w:rFonts w:ascii="Calibri" w:cs="Calibri" w:eastAsia="Calibri" w:hAnsi="Calibri"/>
+            <w:color w:val="5A7A00"/>
+            <w:sz w:val="20"/>
+            <w:szCs w:val="20"/>
+            <w:u w:val="single"/>
+          </w:rPr>
+          <w:t xml:space="preserve">tonyliljon.xyz</w:t>
+        </w:r>
+      </w:hyperlink>
+      <w:r>
+        <w:rPr>
+          <w:rFonts w:ascii="Calibri" w:cs="Calibri" w:eastAsia="Calibri" w:hAnsi="Calibri"/>
+          <w:sz w:val="20"/>
+          <w:szCs w:val="20"/>
+        </w:rPr>
+        <w:t xml:space="preserve"/>
       </w:r>
     </w:p>
     <w:p>
@@ -165,64 +185,100 @@
           <w:sz w:val="20"/>
           <w:szCs w:val="20"/>
         </w:rPr>
-        <w:t xml:space="preserve"> — Trading bot and tracker that logs trading calls by date so traders can see which calls hold up and make better decisions. Designed and built end to end. [add link]</w:t>
-      </w:r>
-    </w:p>
-    <w:p>
-      <w:pPr>
-        <w:pStyle w:val="ListParagraph"/>
-        <w:numPr>
-          <w:ilvl w:val="0"/>
-          <w:numId w:val="2"/>
-        </w:numPr>
-        <w:spacing w:after="40" w:line="259"/>
-      </w:pPr>
-      <w:r>
-        <w:rPr>
-          <w:rFonts w:ascii="Calibri" w:cs="Calibri" w:eastAsia="Calibri" w:hAnsi="Calibri"/>
-          <w:b/>
-          <w:bCs/>
-          <w:sz w:val="20"/>
-          <w:szCs w:val="20"/>
-        </w:rPr>
-        <w:t xml:space="preserve">X Score Cards</w:t>
-      </w:r>
-      <w:r>
-        <w:rPr>
-          <w:rFonts w:ascii="Calibri" w:cs="Calibri" w:eastAsia="Calibri" w:hAnsi="Calibri"/>
-          <w:sz w:val="20"/>
-          <w:szCs w:val="20"/>
-        </w:rPr>
-        <w:t xml:space="preserve"> — App that pulls user data from the X (Twitter) API and generates a scored, shareable card. Used by hundreds of people. [confirm name, add link]</w:t>
-      </w:r>
-    </w:p>
-    <w:p>
-      <w:pPr>
-        <w:pStyle w:val="ListParagraph"/>
-        <w:numPr>
-          <w:ilvl w:val="0"/>
-          <w:numId w:val="2"/>
-        </w:numPr>
-        <w:spacing w:after="40" w:line="259"/>
-      </w:pPr>
-      <w:r>
-        <w:rPr>
-          <w:rFonts w:ascii="Calibri" w:cs="Calibri" w:eastAsia="Calibri" w:hAnsi="Calibri"/>
-          <w:b/>
-          <w:bCs/>
-          <w:sz w:val="20"/>
-          <w:szCs w:val="20"/>
-        </w:rPr>
-        <w:t xml:space="preserve">Web Game Demo</w:t>
-      </w:r>
-      <w:r>
-        <w:rPr>
-          <w:rFonts w:ascii="Calibri" w:cs="Calibri" w:eastAsia="Calibri" w:hAnsi="Calibri"/>
-          <w:sz w:val="20"/>
-          <w:szCs w:val="20"/>
-        </w:rPr>
-        <w:t xml:space="preserve"> — Playable browser game, designed and built end to end, from game feel and UI to code. [confirm name, add link]</w:t>
-      </w:r>
+        <w:t xml:space="preserve"> — Trading bot and tracker that logs trading calls by date so traders can see which calls hold up and make better decisions. Designed and built end to end.  </w:t>
+      </w:r>
+      <w:hyperlink w:history="1" r:id="rIdpc1fcoaeap1znazh_fr3f">
+        <w:r>
+          <w:rPr>
+            <w:rFonts w:ascii="Calibri" w:cs="Calibri" w:eastAsia="Calibri" w:hAnsi="Calibri"/>
+            <w:color w:val="5A7A00"/>
+            <w:sz w:val="20"/>
+            <w:szCs w:val="20"/>
+            <w:u w:val="single"/>
+          </w:rPr>
+          <w:t xml:space="preserve">trade-tracker-tawny-eta.vercel.app</w:t>
+        </w:r>
+      </w:hyperlink>
+    </w:p>
+    <w:p>
+      <w:pPr>
+        <w:pStyle w:val="ListParagraph"/>
+        <w:numPr>
+          <w:ilvl w:val="0"/>
+          <w:numId w:val="2"/>
+        </w:numPr>
+        <w:spacing w:after="40" w:line="259"/>
+      </w:pPr>
+      <w:r>
+        <w:rPr>
+          <w:rFonts w:ascii="Calibri" w:cs="Calibri" w:eastAsia="Calibri" w:hAnsi="Calibri"/>
+          <w:b/>
+          <w:bCs/>
+          <w:sz w:val="20"/>
+          <w:szCs w:val="20"/>
+        </w:rPr>
+        <w:t xml:space="preserve">Ronke Score</w:t>
+      </w:r>
+      <w:r>
+        <w:rPr>
+          <w:rFonts w:ascii="Calibri" w:cs="Calibri" w:eastAsia="Calibri" w:hAnsi="Calibri"/>
+          <w:sz w:val="20"/>
+          <w:szCs w:val="20"/>
+        </w:rPr>
+        <w:t xml:space="preserve"> — App that pulls user data from the X (Twitter) API and generates a scored, shareable card. Used by hundreds of people.  </w:t>
+      </w:r>
+      <w:hyperlink w:history="1" r:id="rIdw8refkzk0h8ts-7bpf8zf">
+        <w:r>
+          <w:rPr>
+            <w:rFonts w:ascii="Calibri" w:cs="Calibri" w:eastAsia="Calibri" w:hAnsi="Calibri"/>
+            <w:color w:val="5A7A00"/>
+            <w:sz w:val="20"/>
+            <w:szCs w:val="20"/>
+            <w:u w:val="single"/>
+          </w:rPr>
+          <w:t xml:space="preserve">ronke-score.vercel.app</w:t>
+        </w:r>
+      </w:hyperlink>
+    </w:p>
+    <w:p>
+      <w:pPr>
+        <w:pStyle w:val="ListParagraph"/>
+        <w:numPr>
+          <w:ilvl w:val="0"/>
+          <w:numId w:val="2"/>
+        </w:numPr>
+        <w:spacing w:after="40" w:line="259"/>
+      </w:pPr>
+      <w:r>
+        <w:rPr>
+          <w:rFonts w:ascii="Calibri" w:cs="Calibri" w:eastAsia="Calibri" w:hAnsi="Calibri"/>
+          <w:b/>
+          <w:bCs/>
+          <w:sz w:val="20"/>
+          <w:szCs w:val="20"/>
+        </w:rPr>
+        <w:t xml:space="preserve">Axie Clash</w:t>
+      </w:r>
+      <w:r>
+        <w:rPr>
+          <w:rFonts w:ascii="Calibri" w:cs="Calibri" w:eastAsia="Calibri" w:hAnsi="Calibri"/>
+          <w:sz w:val="20"/>
+          <w:szCs w:val="20"/>
+        </w:rPr>
+        <w:t xml:space="preserve"> — Playable browser game, designed and built end to end, from game feel and UI to code.  </w:t>
+      </w:r>
+      <w:hyperlink w:history="1" r:id="rIdj4gheqxtftqx0m4pmul_m">
+        <w:r>
+          <w:rPr>
+            <w:rFonts w:ascii="Calibri" w:cs="Calibri" w:eastAsia="Calibri" w:hAnsi="Calibri"/>
+            <w:color w:val="5A7A00"/>
+            <w:sz w:val="20"/>
+            <w:szCs w:val="20"/>
+            <w:u w:val="single"/>
+          </w:rPr>
+          <w:t xml:space="preserve">axie-clash.vercel.app</w:t>
+        </w:r>
+      </w:hyperlink>
     </w:p>
     <w:p>
       <w:pPr>
@@ -287,7 +343,7 @@
           <w:sz w:val="20"/>
           <w:szCs w:val="20"/>
         </w:rPr>
-        <w:t xml:space="preserve">Design Engineer &amp; Product Strategy Consultant</w:t>
+        <w:t xml:space="preserve">Design Engineer, Product Strategy &amp; Ops</w:t>
       </w:r>
     </w:p>
     <w:p>

</xml_diff>

<commit_message>
Copy updates: vibe coding, Trade Tracker, reframe skills section
- Replace 'no-code' with 'vibe coding' across site and résumé
- Rename Confluence to Trade Tracker
- Rewrite hero description so it isn't design-only
- Reframe the combined-skills block around what hands-on range
  brings to the team, not hiring one person for three jobs

Co-Authored-By: Claude Opus 5.5 <noreply@anthropic.com>
Claude-Session: https://claude.ai/code/session_01JGLzwNp3UHs5D5guWwkDQ9
</commit_message>
<xml_diff>
--- a/resume/Anthony_Littlejohn_Resume.docx
+++ b/resume/Anthony_Littlejohn_Resume.docx
@@ -46,7 +46,7 @@
         </w:rPr>
         <w:t xml:space="preserve">Remote / open to relocation  ·  </w:t>
       </w:r>
-      <w:hyperlink w:history="1" r:id="rId3jv31frv5jsbb0ggwbbxd">
+      <w:hyperlink w:history="1" r:id="rIdhj7ec6k69gfkyaa3ihmry">
         <w:r>
           <w:rPr>
             <w:rFonts w:ascii="Calibri" w:cs="Calibri" w:eastAsia="Calibri" w:hAnsi="Calibri"/>
@@ -66,7 +66,7 @@
         </w:rPr>
         <w:t xml:space="preserve">  ·  </w:t>
       </w:r>
-      <w:hyperlink w:history="1" r:id="rId1ybhpite9njfcf-cl8re1">
+      <w:hyperlink w:history="1" r:id="rIdndhouuouhqizplcigyqxc">
         <w:r>
           <w:rPr>
             <w:rFonts w:ascii="Calibri" w:cs="Calibri" w:eastAsia="Calibri" w:hAnsi="Calibri"/>
@@ -86,7 +86,7 @@
         </w:rPr>
         <w:t xml:space="preserve">  ·  </w:t>
       </w:r>
-      <w:hyperlink w:history="1" r:id="rIdzwe3bgvk6swpa-oxguexx">
+      <w:hyperlink w:history="1" r:id="rIdrzuwcyghqkqyywr-a1eyv">
         <w:r>
           <w:rPr>
             <w:rFonts w:ascii="Calibri" w:cs="Calibri" w:eastAsia="Calibri" w:hAnsi="Calibri"/>
@@ -137,7 +137,7 @@
           <w:sz w:val="20"/>
           <w:szCs w:val="20"/>
         </w:rPr>
-        <w:t xml:space="preserve">Design engineer with 10+ years across Web3, gaming, SaaS and B2B. I design products in Figma and build them myself with code, no-code and AI tools, taking ideas from concept to live, working software. A background running operations and a 100+ client design studio means I also bring product strategy, growth and operational thinking to every build.</w:t>
+        <w:t xml:space="preserve">Design engineer with 10+ years across Web3, gaming, SaaS and B2B. I design products in Figma and build them myself with vibe coding and AI tools, taking ideas from concept to live, working software. A background running operations and a 100+ client design studio means I also bring product strategy, growth and operational thinking to every build.</w:t>
       </w:r>
     </w:p>
     <w:p>
@@ -177,7 +177,7 @@
           <w:sz w:val="20"/>
           <w:szCs w:val="20"/>
         </w:rPr>
-        <w:t xml:space="preserve">Confluence</w:t>
+        <w:t xml:space="preserve">Trade Tracker</w:t>
       </w:r>
       <w:r>
         <w:rPr>
@@ -187,7 +187,7 @@
         </w:rPr>
         <w:t xml:space="preserve"> — Trading bot and tracker that logs trading calls by date so traders can see which calls hold up and make better decisions. Designed and built end to end.  </w:t>
       </w:r>
-      <w:hyperlink w:history="1" r:id="rIdpc1fcoaeap1znazh_fr3f">
+      <w:hyperlink w:history="1" r:id="rIduadzi0u-rabgtcyb41ax8">
         <w:r>
           <w:rPr>
             <w:rFonts w:ascii="Calibri" w:cs="Calibri" w:eastAsia="Calibri" w:hAnsi="Calibri"/>
@@ -227,7 +227,7 @@
         </w:rPr>
         <w:t xml:space="preserve"> — App that pulls user data from the X (Twitter) API and generates a scored, shareable card. Used by hundreds of people.  </w:t>
       </w:r>
-      <w:hyperlink w:history="1" r:id="rIdw8refkzk0h8ts-7bpf8zf">
+      <w:hyperlink w:history="1" r:id="rId3ec89_cgj_iugbsxswyco">
         <w:r>
           <w:rPr>
             <w:rFonts w:ascii="Calibri" w:cs="Calibri" w:eastAsia="Calibri" w:hAnsi="Calibri"/>
@@ -267,7 +267,7 @@
         </w:rPr>
         <w:t xml:space="preserve"> — Playable browser game, designed and built end to end, from game feel and UI to code.  </w:t>
       </w:r>
-      <w:hyperlink w:history="1" r:id="rIdj4gheqxtftqx0m4pmul_m">
+      <w:hyperlink w:history="1" r:id="rIdvhti_l0l-kkqm4xz45jaf">
         <w:r>
           <w:rPr>
             <w:rFonts w:ascii="Calibri" w:cs="Calibri" w:eastAsia="Calibri" w:hAnsi="Calibri"/>
@@ -1022,7 +1022,7 @@
           <w:sz w:val="20"/>
           <w:szCs w:val="20"/>
         </w:rPr>
-        <w:t xml:space="preserve">Figma, prototyping, design systems, HTML/CSS/JS, AI-assisted coding, API integrations, Webflow, WordPress</w:t>
+        <w:t xml:space="preserve">Figma, prototyping, design systems, HTML/CSS/JS, vibe coding, AI-assisted development, API integrations, Webflow, WordPress</w:t>
       </w:r>
     </w:p>
     <w:p>

</xml_diff>

<commit_message>
Fix LinkedIn link and tidy experience timeline
- LinkedIn now points to the correct profile URL
- Sukuri Protocol starts Dec 2021 (after Nestcoin)
- Mark Bloom Studio as a contract role
- Add Dec 2022 – Jul 2024 freelance period
- Résumé updated to match

Co-Authored-By: Claude Opus 5.5 <noreply@anthropic.com>
Claude-Session: https://claude.ai/code/session_01JGLzwNp3UHs5D5guWwkDQ9
</commit_message>
<xml_diff>
--- a/resume/Anthony_Littlejohn_Resume.docx
+++ b/resume/Anthony_Littlejohn_Resume.docx
@@ -46,7 +46,7 @@
         </w:rPr>
         <w:t xml:space="preserve">Remote / open to relocation  ·  </w:t>
       </w:r>
-      <w:hyperlink w:history="1" r:id="rIdhj7ec6k69gfkyaa3ihmry">
+      <w:hyperlink w:history="1" r:id="rIdn2zf1rxtg0ry9t9ml1xpq">
         <w:r>
           <w:rPr>
             <w:rFonts w:ascii="Calibri" w:cs="Calibri" w:eastAsia="Calibri" w:hAnsi="Calibri"/>
@@ -66,7 +66,7 @@
         </w:rPr>
         <w:t xml:space="preserve">  ·  </w:t>
       </w:r>
-      <w:hyperlink w:history="1" r:id="rIdndhouuouhqizplcigyqxc">
+      <w:hyperlink w:history="1" r:id="rIddzl-elrho3a83h4gsy-ob">
         <w:r>
           <w:rPr>
             <w:rFonts w:ascii="Calibri" w:cs="Calibri" w:eastAsia="Calibri" w:hAnsi="Calibri"/>
@@ -75,7 +75,7 @@
             <w:szCs w:val="20"/>
             <w:u w:val="single"/>
           </w:rPr>
-          <w:t xml:space="preserve">linkedin.com/in/tonyliljon</w:t>
+          <w:t xml:space="preserve">LinkedIn</w:t>
         </w:r>
       </w:hyperlink>
       <w:r>
@@ -86,7 +86,7 @@
         </w:rPr>
         <w:t xml:space="preserve">  ·  </w:t>
       </w:r>
-      <w:hyperlink w:history="1" r:id="rIdrzuwcyghqkqyywr-a1eyv">
+      <w:hyperlink w:history="1" r:id="rIdctb4g5fiirw6quafld7lx">
         <w:r>
           <w:rPr>
             <w:rFonts w:ascii="Calibri" w:cs="Calibri" w:eastAsia="Calibri" w:hAnsi="Calibri"/>
@@ -187,7 +187,7 @@
         </w:rPr>
         <w:t xml:space="preserve"> — Trading bot and tracker that logs trading calls by date so traders can see which calls hold up and make better decisions. Designed and built end to end.  </w:t>
       </w:r>
-      <w:hyperlink w:history="1" r:id="rIduadzi0u-rabgtcyb41ax8">
+      <w:hyperlink w:history="1" r:id="rIdjqt8wwbe2kchpx5h6q0ht">
         <w:r>
           <w:rPr>
             <w:rFonts w:ascii="Calibri" w:cs="Calibri" w:eastAsia="Calibri" w:hAnsi="Calibri"/>
@@ -227,7 +227,7 @@
         </w:rPr>
         <w:t xml:space="preserve"> — App that pulls user data from the X (Twitter) API and generates a scored, shareable card. Used by hundreds of people.  </w:t>
       </w:r>
-      <w:hyperlink w:history="1" r:id="rId3ec89_cgj_iugbsxswyco">
+      <w:hyperlink w:history="1" r:id="rIdrlcfh6horxayok7rhmzav">
         <w:r>
           <w:rPr>
             <w:rFonts w:ascii="Calibri" w:cs="Calibri" w:eastAsia="Calibri" w:hAnsi="Calibri"/>
@@ -267,7 +267,7 @@
         </w:rPr>
         <w:t xml:space="preserve"> — Playable browser game, designed and built end to end, from game feel and UI to code.  </w:t>
       </w:r>
-      <w:hyperlink w:history="1" r:id="rIdvhti_l0l-kkqm4xz45jaf">
+      <w:hyperlink w:history="1" r:id="rIddxs2c_6xyygkwqoqt--n_">
         <w:r>
           <w:rPr>
             <w:rFonts w:ascii="Calibri" w:cs="Calibri" w:eastAsia="Calibri" w:hAnsi="Calibri"/>
@@ -607,7 +607,7 @@
           <w:sz w:val="20"/>
           <w:szCs w:val="20"/>
         </w:rPr>
-        <w:t xml:space="preserve">UI/UX Designer, Web3 Game Studio</w:t>
+        <w:t xml:space="preserve">Senior UI/UX Designer (Contract)</w:t>
       </w:r>
     </w:p>
     <w:p>
@@ -699,6 +699,70 @@
           <w:sz w:val="22"/>
           <w:szCs w:val="22"/>
         </w:rPr>
+        <w:t xml:space="preserve">Freelance</w:t>
+      </w:r>
+      <w:r>
+        <w:rPr>
+          <w:rFonts w:ascii="Calibri" w:cs="Calibri" w:eastAsia="Calibri" w:hAnsi="Calibri"/>
+          <w:color w:val="555555"/>
+          <w:sz w:val="20"/>
+          <w:szCs w:val="20"/>
+        </w:rPr>
+        <w:t xml:space="preserve">	Dec 2022 – Jul 2024</w:t>
+      </w:r>
+    </w:p>
+    <w:p>
+      <w:pPr>
+        <w:keepNext/>
+        <w:spacing w:after="50"/>
+      </w:pPr>
+      <w:r>
+        <w:rPr>
+          <w:rFonts w:ascii="Calibri" w:cs="Calibri" w:eastAsia="Calibri" w:hAnsi="Calibri"/>
+          <w:i/>
+          <w:iCs/>
+          <w:color w:val="555555"/>
+          <w:sz w:val="20"/>
+          <w:szCs w:val="20"/>
+        </w:rPr>
+        <w:t xml:space="preserve">Product Designer &amp; Consultant</w:t>
+      </w:r>
+    </w:p>
+    <w:p>
+      <w:pPr>
+        <w:pStyle w:val="ListParagraph"/>
+        <w:numPr>
+          <w:ilvl w:val="0"/>
+          <w:numId w:val="2"/>
+        </w:numPr>
+        <w:spacing w:after="40" w:line="259"/>
+      </w:pPr>
+      <w:r>
+        <w:rPr>
+          <w:rFonts w:ascii="Calibri" w:cs="Calibri" w:eastAsia="Calibri" w:hAnsi="Calibri"/>
+          <w:sz w:val="20"/>
+          <w:szCs w:val="20"/>
+        </w:rPr>
+        <w:t xml:space="preserve">Delivered product design, branding and consulting projects for clients between full-time roles.</w:t>
+      </w:r>
+    </w:p>
+    <w:p>
+      <w:pPr>
+        <w:keepNext/>
+        <w:keepLines/>
+        <w:tabs>
+          <w:tab w:val="right" w:pos="10080"/>
+        </w:tabs>
+        <w:spacing w:after="0" w:before="140"/>
+      </w:pPr>
+      <w:r>
+        <w:rPr>
+          <w:rFonts w:ascii="Calibri" w:cs="Calibri" w:eastAsia="Calibri" w:hAnsi="Calibri"/>
+          <w:b/>
+          <w:bCs/>
+          <w:sz w:val="22"/>
+          <w:szCs w:val="22"/>
+        </w:rPr>
         <w:t xml:space="preserve">Sukuri Protocol</w:t>
       </w:r>
       <w:r>
@@ -708,7 +772,7 @@
           <w:sz w:val="20"/>
           <w:szCs w:val="20"/>
         </w:rPr>
-        <w:t xml:space="preserve">	Sep 2021 – Nov 2022</w:t>
+        <w:t xml:space="preserve">	Dec 2021 – Nov 2022</w:t>
       </w:r>
     </w:p>
     <w:p>

</xml_diff>